<commit_message>
Add new images and update documentation for Lua filter and metadata in Pandoc DOCX output
</commit_message>
<xml_diff>
--- a/docx/tool_pandoc_lua.docx
+++ b/docx/tool_pandoc_lua.docx
@@ -4045,6 +4045,33 @@
         <w:pStyle w:val="a0"/>
       </w:pPr>
     </w:p>
+    <w:p>
+      <w:pPr>
+        <w:pStyle w:val="a8"/>
+      </w:pPr>
+      <w:r>
+        <w:t xml:space="preserve">Lua Filter and Metadata</w:t>
+      </w:r>
+    </w:p>
+    <w:p>
+      <w:pPr>
+        <w:pStyle w:val="a8"/>
+      </w:pPr>
+      <w:r>
+        <w:t xml:space="preserve">signature.yaml // Metafile 에서 각 데이타 정보 추출</w:t>
+      </w:r>
+      <w:r>
+        <w:br/>
+      </w:r>
+      <w:r>
+        <w:t xml:space="preserve">lua/signature.lua // 상위 Metafile 정보 기반으로 적용</w:t>
+      </w:r>
+    </w:p>
+    <w:p>
+      <w:pPr>
+        <w:pStyle w:val="FirstParagraph"/>
+      </w:pPr>
+    </w:p>
     <w:bookmarkEnd w:id="125"/>
     <w:bookmarkStart w:id="126" w:name="lua-filter-script-b"/>
     <w:p>
@@ -4258,6 +4285,15 @@
           <w:rStyle w:val="VerbatimChar"/>
         </w:rPr>
         <w:t xml:space="preserve">                "--number-sections",</w:t>
+      </w:r>
+      <w:r>
+        <w:br/>
+      </w:r>
+      <w:r>
+        <w:rPr>
+          <w:rStyle w:val="VerbatimChar"/>
+        </w:rPr>
+        <w:t xml:space="preserve">                "--metadata-file=.\\docx\\lua\\signature.yaml", //signature.lua meta data </w:t>
       </w:r>
       <w:r>
         <w:br/>

</xml_diff>

<commit_message>
Add new Lua filter and JSON support for test results in Pandoc DOCX output
</commit_message>
<xml_diff>
--- a/docx/tool_pandoc_lua.docx
+++ b/docx/tool_pandoc_lua.docx
@@ -3614,7 +3614,7 @@
     </w:p>
     <w:bookmarkEnd w:id="120"/>
     <w:bookmarkEnd w:id="121"/>
-    <w:bookmarkStart w:id="128" w:name="lua-filter"/>
+    <w:bookmarkStart w:id="135" w:name="lua-filter"/>
     <w:p>
       <w:pPr>
         <w:pStyle w:val="2"/>
@@ -3854,7 +3854,7 @@
         <w:pStyle w:val="a0"/>
       </w:pPr>
     </w:p>
-    <w:bookmarkStart w:id="125" w:name="lua-filter-script-a"/>
+    <w:bookmarkStart w:id="128" w:name="lua-filter-script-a"/>
     <w:p>
       <w:pPr>
         <w:pStyle w:val="3"/>
@@ -4050,51 +4050,8 @@
         <w:pStyle w:val="a8"/>
       </w:pPr>
       <w:r>
-        <w:t xml:space="preserve">Lua Filter and Metadata</w:t>
-      </w:r>
-    </w:p>
-    <w:p>
-      <w:pPr>
-        <w:pStyle w:val="a8"/>
-      </w:pPr>
-      <w:r>
-        <w:t xml:space="preserve">signature.yaml // Metafile 에서 각 데이타 정보 추출</w:t>
-      </w:r>
-      <w:r>
-        <w:br/>
-      </w:r>
-      <w:r>
-        <w:t xml:space="preserve">lua/signature.lua // 상위 Metafile 정보 기반으로 적용</w:t>
-      </w:r>
-    </w:p>
-    <w:p>
-      <w:pPr>
-        <w:pStyle w:val="FirstParagraph"/>
-      </w:pPr>
-    </w:p>
-    <w:bookmarkEnd w:id="125"/>
-    <w:bookmarkStart w:id="126" w:name="lua-filter-script-b"/>
-    <w:p>
-      <w:pPr>
-        <w:pStyle w:val="3"/>
-      </w:pPr>
-      <w:r>
-        <w:rPr>
-          <w:rStyle w:val="SectionNumber"/>
-        </w:rPr>
-        <w:t xml:space="preserve">7.2</w:t>
-      </w:r>
-      <w:r>
-        <w:tab/>
-      </w:r>
-      <w:r>
-        <w:t xml:space="preserve">Lua Filter Script-B</w:t>
-      </w:r>
-    </w:p>
-    <w:p>
-      <w:pPr>
-        <w:pStyle w:val="FirstParagraph"/>
-      </w:pPr>
+        <w:t xml:space="preserve">상위 구분자 와 Lua Filter and Metadata</w:t>
+      </w:r>
     </w:p>
     <w:p>
       <w:pPr>
@@ -4102,6 +4059,172 @@
         <w:numPr>
           <w:ilvl w:val="0"/>
           <w:numId w:val="1043"/>
+        </w:numPr>
+      </w:pPr>
+      <w:r>
+        <w:rPr>
+          <w:b/>
+          <w:bCs/>
+        </w:rPr>
+        <w:t xml:space="preserve">lua/signature.yaml</w:t>
+      </w:r>
+      <w:r>
+        <w:t xml:space="preserve"> </w:t>
+      </w:r>
+      <w:r>
+        <w:t xml:space="preserve">// Metafile 에서 각 데이타 정보 추출</w:t>
+      </w:r>
+      <w:r>
+        <w:br/>
+      </w:r>
+    </w:p>
+    <w:p>
+      <w:pPr>
+        <w:pStyle w:val="Compact"/>
+        <w:numPr>
+          <w:ilvl w:val="0"/>
+          <w:numId w:val="1043"/>
+        </w:numPr>
+      </w:pPr>
+      <w:r>
+        <w:rPr>
+          <w:b/>
+          <w:bCs/>
+        </w:rPr>
+        <w:t xml:space="preserve">lua/signature.lua</w:t>
+      </w:r>
+      <w:r>
+        <w:t xml:space="preserve"> </w:t>
+      </w:r>
+      <w:r>
+        <w:t xml:space="preserve">// 상위 Metafile 정보 기반으로 적용</w:t>
+      </w:r>
+    </w:p>
+    <w:p>
+      <w:pPr>
+        <w:pStyle w:val="a8"/>
+      </w:pPr>
+      <w:r>
+        <w:rPr>
+          <w:b/>
+          <w:bCs/>
+        </w:rPr>
+        <w:t xml:space="preserve">즉 yaml 정보파일 (Metafile은 YAML로 이용) 과 정보 image path 이용</w:t>
+      </w:r>
+    </w:p>
+    <w:p>
+      <w:pPr>
+        <w:pStyle w:val="FirstParagraph"/>
+      </w:pPr>
+    </w:p>
+    <w:p>
+      <w:pPr>
+        <w:pStyle w:val="Compact"/>
+        <w:numPr>
+          <w:ilvl w:val="0"/>
+          <w:numId w:val="1044"/>
+        </w:numPr>
+      </w:pPr>
+      <w:r>
+        <w:t xml:space="preserve">docx/tool_pandoc_lua.docx</w:t>
+      </w:r>
+      <w:r>
+        <w:br/>
+      </w:r>
+      <w:r>
+        <w:rPr>
+          <w:b/>
+          <w:bCs/>
+        </w:rPr>
+        <w:t xml:space="preserve">pandoc result</w:t>
+      </w:r>
+      <w:r>
+        <w:t xml:space="preserve"> </w:t>
+      </w:r>
+      <w:r>
+        <w:t xml:space="preserve">// pandoc 실행 결과</w:t>
+      </w:r>
+      <w:r>
+        <w:t xml:space="preserve"> </w:t>
+      </w:r>
+      <w:r>
+        <w:drawing>
+          <wp:inline>
+            <wp:extent cx="5943600" cy="3501467"/>
+            <wp:effectExtent b="0" l="0" r="0" t="0"/>
+            <wp:docPr descr="" title="" id="126" name="Picture"/>
+            <a:graphic>
+              <a:graphicData uri="http://schemas.openxmlformats.org/drawingml/2006/picture">
+                <pic:pic>
+                  <pic:nvPicPr>
+                    <pic:cNvPr descr="./imgs/pandoc_docx_16.png" id="127" name="Picture"/>
+                    <pic:cNvPicPr>
+                      <a:picLocks noChangeArrowheads="1" noChangeAspect="1"/>
+                    </pic:cNvPicPr>
+                  </pic:nvPicPr>
+                  <pic:blipFill>
+                    <a:blip r:embed="rId125"/>
+                    <a:stretch>
+                      <a:fillRect/>
+                    </a:stretch>
+                  </pic:blipFill>
+                  <pic:spPr bwMode="auto">
+                    <a:xfrm>
+                      <a:off x="0" y="0"/>
+                      <a:ext cx="5943600" cy="3501467"/>
+                    </a:xfrm>
+                    <a:prstGeom prst="rect">
+                      <a:avLst/>
+                    </a:prstGeom>
+                    <a:noFill/>
+                    <a:ln w="9525">
+                      <a:noFill/>
+                      <a:headEnd/>
+                      <a:tailEnd/>
+                    </a:ln>
+                  </pic:spPr>
+                </pic:pic>
+              </a:graphicData>
+            </a:graphic>
+          </wp:inline>
+        </w:drawing>
+      </w:r>
+    </w:p>
+    <w:p>
+      <w:pPr>
+        <w:pStyle w:val="FirstParagraph"/>
+      </w:pPr>
+    </w:p>
+    <w:bookmarkEnd w:id="128"/>
+    <w:bookmarkStart w:id="132" w:name="lua-filter-script-b"/>
+    <w:p>
+      <w:pPr>
+        <w:pStyle w:val="3"/>
+      </w:pPr>
+      <w:r>
+        <w:rPr>
+          <w:rStyle w:val="SectionNumber"/>
+        </w:rPr>
+        <w:t xml:space="preserve">7.2</w:t>
+      </w:r>
+      <w:r>
+        <w:tab/>
+      </w:r>
+      <w:r>
+        <w:t xml:space="preserve">Lua Filter Script-B</w:t>
+      </w:r>
+    </w:p>
+    <w:p>
+      <w:pPr>
+        <w:pStyle w:val="FirstParagraph"/>
+      </w:pPr>
+    </w:p>
+    <w:p>
+      <w:pPr>
+        <w:pStyle w:val="Compact"/>
+        <w:numPr>
+          <w:ilvl w:val="0"/>
+          <w:numId w:val="1045"/>
         </w:numPr>
       </w:pPr>
       <w:r>
@@ -4206,26 +4329,18 @@
     </w:tbl>
     <w:p>
       <w:pPr>
-        <w:pStyle w:val="FirstParagraph"/>
-      </w:pPr>
-    </w:p>
-    <w:bookmarkEnd w:id="126"/>
-    <w:bookmarkStart w:id="127" w:name="pandoc-args"/>
-    <w:p>
-      <w:pPr>
-        <w:pStyle w:val="3"/>
-      </w:pPr>
-      <w:r>
-        <w:rPr>
-          <w:rStyle w:val="SectionNumber"/>
-        </w:rPr>
-        <w:t xml:space="preserve">7.3</w:t>
-      </w:r>
-      <w:r>
-        <w:tab/>
-      </w:r>
-      <w:r>
-        <w:t xml:space="preserve">Pandoc Args</w:t>
+        <w:pStyle w:val="a8"/>
+      </w:pPr>
+      <w:r>
+        <w:t xml:space="preserve">상위 구분자 와 information.lua</w:t>
+      </w:r>
+    </w:p>
+    <w:p>
+      <w:pPr>
+        <w:pStyle w:val="a8"/>
+      </w:pPr>
+      <w:r>
+        <w:t xml:space="preserve">간단히 lua filter만 이용하여 외부파일 읽기</w:t>
       </w:r>
     </w:p>
     <w:p>
@@ -4238,14 +4353,456 @@
         <w:pStyle w:val="Compact"/>
         <w:numPr>
           <w:ilvl w:val="0"/>
-          <w:numId w:val="1044"/>
+          <w:numId w:val="1046"/>
         </w:numPr>
       </w:pPr>
+      <w:r>
+        <w:t xml:space="preserve">docx/tool_pandoc_lua.docx</w:t>
+      </w:r>
+      <w:r>
+        <w:br/>
+      </w:r>
       <w:r>
         <w:rPr>
           <w:b/>
           <w:bCs/>
         </w:rPr>
+        <w:t xml:space="preserve">pandoc result</w:t>
+      </w:r>
+      <w:r>
+        <w:t xml:space="preserve"> </w:t>
+      </w:r>
+      <w:r>
+        <w:t xml:space="preserve">// pandoc 실행 결과</w:t>
+      </w:r>
+      <w:r>
+        <w:t xml:space="preserve"> </w:t>
+      </w:r>
+      <w:r>
+        <w:drawing>
+          <wp:inline>
+            <wp:extent cx="5943600" cy="2968135"/>
+            <wp:effectExtent b="0" l="0" r="0" t="0"/>
+            <wp:docPr descr="" title="" id="130" name="Picture"/>
+            <a:graphic>
+              <a:graphicData uri="http://schemas.openxmlformats.org/drawingml/2006/picture">
+                <pic:pic>
+                  <pic:nvPicPr>
+                    <pic:cNvPr descr="./imgs/pandoc_docx_17.png" id="131" name="Picture"/>
+                    <pic:cNvPicPr>
+                      <a:picLocks noChangeArrowheads="1" noChangeAspect="1"/>
+                    </pic:cNvPicPr>
+                  </pic:nvPicPr>
+                  <pic:blipFill>
+                    <a:blip r:embed="rId129"/>
+                    <a:stretch>
+                      <a:fillRect/>
+                    </a:stretch>
+                  </pic:blipFill>
+                  <pic:spPr bwMode="auto">
+                    <a:xfrm>
+                      <a:off x="0" y="0"/>
+                      <a:ext cx="5943600" cy="2968135"/>
+                    </a:xfrm>
+                    <a:prstGeom prst="rect">
+                      <a:avLst/>
+                    </a:prstGeom>
+                    <a:noFill/>
+                    <a:ln w="9525">
+                      <a:noFill/>
+                      <a:headEnd/>
+                      <a:tailEnd/>
+                    </a:ln>
+                  </pic:spPr>
+                </pic:pic>
+              </a:graphicData>
+            </a:graphic>
+          </wp:inline>
+        </w:drawing>
+      </w:r>
+    </w:p>
+    <w:p>
+      <w:pPr>
+        <w:pStyle w:val="FirstParagraph"/>
+      </w:pPr>
+    </w:p>
+    <w:bookmarkEnd w:id="132"/>
+    <w:bookmarkStart w:id="133" w:name="lua-filter-script-c"/>
+    <w:p>
+      <w:pPr>
+        <w:pStyle w:val="3"/>
+      </w:pPr>
+      <w:r>
+        <w:rPr>
+          <w:rStyle w:val="SectionNumber"/>
+        </w:rPr>
+        <w:t xml:space="preserve">7.3</w:t>
+      </w:r>
+      <w:r>
+        <w:tab/>
+      </w:r>
+      <w:r>
+        <w:t xml:space="preserve">Lua Filter Script-C</w:t>
+      </w:r>
+    </w:p>
+    <w:p>
+      <w:pPr>
+        <w:pStyle w:val="FirstParagraph"/>
+      </w:pPr>
+    </w:p>
+    <w:p>
+      <w:pPr>
+        <w:pStyle w:val="Compact"/>
+        <w:numPr>
+          <w:ilvl w:val="0"/>
+          <w:numId w:val="1047"/>
+        </w:numPr>
+      </w:pPr>
+      <w:r>
+        <w:rPr>
+          <w:b/>
+          <w:bCs/>
+        </w:rPr>
+        <w:t xml:space="preserve">TEST Lua Filter-3</w:t>
+      </w:r>
+    </w:p>
+    <w:tbl>
+      <w:tblPr>
+        <w:tblStyle w:val="Table"/>
+        <w:tblW w:type="pct" w:w="5000"/>
+        <w:tblLayout w:type="fixed"/>
+        <w:tblLook w:firstRow="0" w:lastRow="0" w:firstColumn="0" w:lastColumn="0" w:noHBand="0" w:noVBand="0" w:val="0000"/>
+      </w:tblPr>
+      <w:tblGrid>
+        <w:gridCol w:w="2376"/>
+        <w:gridCol w:w="5544"/>
+      </w:tblGrid>
+      <w:tr>
+        <w:tc>
+          <w:tcPr/>
+          <w:p>
+            <w:pPr>
+              <w:jc w:val="left"/>
+            </w:pPr>
+            <w:r>
+              <w:t xml:space="preserve">Test ID</w:t>
+            </w:r>
+          </w:p>
+        </w:tc>
+        <w:tc>
+          <w:tcPr/>
+          <w:p>
+            <w:pPr>
+              <w:jc w:val="left"/>
+            </w:pPr>
+            <w:r>
+              <w:t xml:space="preserve">CT-UART-001</w:t>
+            </w:r>
+          </w:p>
+        </w:tc>
+      </w:tr>
+      <w:tr>
+        <w:tc>
+          <w:tcPr/>
+          <w:p>
+            <w:pPr>
+              <w:jc w:val="left"/>
+            </w:pPr>
+            <w:r>
+              <w:t xml:space="preserve">Result</w:t>
+            </w:r>
+          </w:p>
+        </w:tc>
+        <w:tc>
+          <w:tcPr/>
+          <w:p>
+            <w:pPr>
+              <w:jc w:val="left"/>
+            </w:pPr>
+            <w:r>
+              <w:t xml:space="preserve">PASS</w:t>
+            </w:r>
+          </w:p>
+        </w:tc>
+      </w:tr>
+      <w:tr>
+        <w:tc>
+          <w:tcPr/>
+          <w:p>
+            <w:pPr>
+              <w:jc w:val="left"/>
+            </w:pPr>
+            <w:r>
+              <w:t xml:space="preserve">Execution ID</w:t>
+            </w:r>
+          </w:p>
+        </w:tc>
+        <w:tc>
+          <w:tcPr/>
+          <w:p>
+            <w:pPr>
+              <w:jc w:val="left"/>
+            </w:pPr>
+            <w:r>
+              <w:t xml:space="preserve">20260909-001</w:t>
+            </w:r>
+          </w:p>
+        </w:tc>
+      </w:tr>
+      <w:tr>
+        <w:tc>
+          <w:tcPr/>
+          <w:p>
+            <w:pPr>
+              <w:jc w:val="left"/>
+            </w:pPr>
+            <w:r>
+              <w:t xml:space="preserve">Timestamp</w:t>
+            </w:r>
+          </w:p>
+        </w:tc>
+        <w:tc>
+          <w:tcPr/>
+          <w:p>
+            <w:pPr>
+              <w:jc w:val="left"/>
+            </w:pPr>
+            <w:r>
+              <w:t xml:space="preserve">2026-09-09T11:30:00</w:t>
+            </w:r>
+          </w:p>
+        </w:tc>
+      </w:tr>
+      <w:tr>
+        <w:tc>
+          <w:tcPr/>
+          <w:p>
+            <w:pPr>
+              <w:jc w:val="left"/>
+            </w:pPr>
+            <w:r>
+              <w:t xml:space="preserve">Runner</w:t>
+            </w:r>
+          </w:p>
+        </w:tc>
+        <w:tc>
+          <w:tcPr/>
+          <w:p>
+            <w:pPr>
+              <w:jc w:val="left"/>
+            </w:pPr>
+            <w:r>
+              <w:t xml:space="preserve">Windows</w:t>
+            </w:r>
+          </w:p>
+        </w:tc>
+      </w:tr>
+      <w:tr>
+        <w:tc>
+          <w:tcPr/>
+          <w:p>
+            <w:pPr>
+              <w:jc w:val="left"/>
+            </w:pPr>
+            <w:r>
+              <w:t xml:space="preserve">Duration</w:t>
+            </w:r>
+          </w:p>
+        </w:tc>
+        <w:tc>
+          <w:tcPr/>
+          <w:p>
+            <w:pPr>
+              <w:jc w:val="left"/>
+            </w:pPr>
+            <w:r>
+              <w:t xml:space="preserve">1820.0 ms</w:t>
+            </w:r>
+          </w:p>
+        </w:tc>
+      </w:tr>
+      <w:tr>
+        <w:tc>
+          <w:tcPr/>
+          <w:p>
+            <w:pPr>
+              <w:jc w:val="left"/>
+            </w:pPr>
+            <w:r>
+              <w:t xml:space="preserve">Interface</w:t>
+            </w:r>
+          </w:p>
+        </w:tc>
+        <w:tc>
+          <w:tcPr/>
+          <w:p>
+            <w:pPr>
+              <w:jc w:val="left"/>
+            </w:pPr>
+            <w:r>
+              <w:t xml:space="preserve">UART</w:t>
+            </w:r>
+          </w:p>
+        </w:tc>
+      </w:tr>
+      <w:tr>
+        <w:tc>
+          <w:tcPr/>
+          <w:p>
+            <w:pPr>
+              <w:jc w:val="left"/>
+            </w:pPr>
+            <w:r>
+              <w:t xml:space="preserve">Equipment</w:t>
+            </w:r>
+          </w:p>
+        </w:tc>
+        <w:tc>
+          <w:tcPr/>
+          <w:p>
+            <w:pPr>
+              <w:jc w:val="left"/>
+            </w:pPr>
+            <w:r>
+              <w:t xml:space="preserve">Digilent</w:t>
+            </w:r>
+          </w:p>
+        </w:tc>
+      </w:tr>
+      <w:tr>
+        <w:tc>
+          <w:tcPr/>
+          <w:p>
+            <w:pPr>
+              <w:jc w:val="left"/>
+            </w:pPr>
+            <w:r>
+              <w:t xml:space="preserve">Fixture Mode</w:t>
+            </w:r>
+          </w:p>
+        </w:tc>
+        <w:tc>
+          <w:tcPr/>
+          <w:p>
+            <w:pPr>
+              <w:jc w:val="left"/>
+            </w:pPr>
+            <w:r>
+              <w:t xml:space="preserve">mock</w:t>
+            </w:r>
+          </w:p>
+        </w:tc>
+      </w:tr>
+    </w:tbl>
+    <w:p>
+      <w:pPr>
+        <w:pStyle w:val="a0"/>
+      </w:pPr>
+    </w:p>
+    <w:p>
+      <w:pPr>
+        <w:pStyle w:val="a8"/>
+      </w:pPr>
+      <w:r>
+        <w:t xml:space="preserve">상위 구분자 와 information.lua</w:t>
+      </w:r>
+      <w:r>
+        <w:br/>
+      </w:r>
+      <w:r>
+        <w:t xml:space="preserve">1. test_result.json</w:t>
+      </w:r>
+      <w:r>
+        <w:t xml:space="preserve"> </w:t>
+      </w:r>
+      <w:r>
+        <w:t xml:space="preserve">2. test_result.lua</w:t>
+      </w:r>
+      <w:r>
+        <w:t xml:space="preserve"> </w:t>
+      </w:r>
+      <w:r>
+        <w:t xml:space="preserve">간단히 lua filter만 이용하여 외부파일 읽기</w:t>
+      </w:r>
+    </w:p>
+    <w:p>
+      <w:pPr>
+        <w:pStyle w:val="FirstParagraph"/>
+      </w:pPr>
+    </w:p>
+    <w:p>
+      <w:pPr>
+        <w:pStyle w:val="Compact"/>
+        <w:numPr>
+          <w:ilvl w:val="0"/>
+          <w:numId w:val="1048"/>
+        </w:numPr>
+      </w:pPr>
+      <w:r>
+        <w:t xml:space="preserve">docx/tool_pandoc_lua.docx</w:t>
+      </w:r>
+      <w:r>
+        <w:br/>
+      </w:r>
+      <w:r>
+        <w:rPr>
+          <w:b/>
+          <w:bCs/>
+        </w:rPr>
+        <w:t xml:space="preserve">pandoc result</w:t>
+      </w:r>
+      <w:r>
+        <w:t xml:space="preserve"> </w:t>
+      </w:r>
+      <w:r>
+        <w:t xml:space="preserve">// pandoc 실행 결과</w:t>
+      </w:r>
+      <w:r>
+        <w:t xml:space="preserve"> </w:t>
+      </w:r>
+    </w:p>
+    <w:p>
+      <w:pPr>
+        <w:pStyle w:val="FirstParagraph"/>
+      </w:pPr>
+    </w:p>
+    <w:bookmarkEnd w:id="133"/>
+    <w:bookmarkStart w:id="134" w:name="pandoc-args"/>
+    <w:p>
+      <w:pPr>
+        <w:pStyle w:val="3"/>
+      </w:pPr>
+      <w:r>
+        <w:rPr>
+          <w:rStyle w:val="SectionNumber"/>
+        </w:rPr>
+        <w:t xml:space="preserve">7.4</w:t>
+      </w:r>
+      <w:r>
+        <w:tab/>
+      </w:r>
+      <w:r>
+        <w:t xml:space="preserve">Pandoc Args</w:t>
+      </w:r>
+    </w:p>
+    <w:p>
+      <w:pPr>
+        <w:pStyle w:val="FirstParagraph"/>
+      </w:pPr>
+    </w:p>
+    <w:p>
+      <w:pPr>
+        <w:pStyle w:val="Compact"/>
+        <w:numPr>
+          <w:ilvl w:val="0"/>
+          <w:numId w:val="1049"/>
+        </w:numPr>
+      </w:pPr>
+      <w:r>
+        <w:rPr>
+          <w:b/>
+          <w:bCs/>
+        </w:rPr>
         <w:t xml:space="preserve">VS Code Task</w:t>
       </w:r>
       <w:r>
@@ -4350,8 +4907,8 @@
         <w:t xml:space="preserve">                ".\\docx\\tool_pandoc.docx"</w:t>
       </w:r>
     </w:p>
-    <w:bookmarkEnd w:id="127"/>
-    <w:bookmarkEnd w:id="128"/>
+    <w:bookmarkEnd w:id="134"/>
+    <w:bookmarkEnd w:id="135"/>
     <w:sectPr>
       <w:headerReference r:id="rId26" w:type="default"/>
       <w:footerReference r:id="rId27" w:type="default"/>
@@ -5112,6 +5669,91 @@
       </w:rPr>
     </w:lvl>
   </w:abstractNum>
+  <w:abstractNum w:abstractNumId="99411">
+    <w:nsid w:val="00A99411"/>
+    <w:multiLevelType w:val="multilevel"/>
+    <w:lvl w:ilvl="0">
+      <w:start w:val="1"/>
+      <w:numFmt w:val="decimal"/>
+      <w:lvlText w:val="%1."/>
+      <w:lvlJc w:val="left"/>
+      <w:pPr>
+        <w:ind w:left="720" w:hanging="360"/>
+      </w:pPr>
+    </w:lvl>
+    <w:lvl w:ilvl="1">
+      <w:start w:val="1"/>
+      <w:numFmt w:val="decimal"/>
+      <w:lvlText w:val="%2."/>
+      <w:lvlJc w:val="left"/>
+      <w:pPr>
+        <w:ind w:left="1440" w:hanging="360"/>
+      </w:pPr>
+    </w:lvl>
+    <w:lvl w:ilvl="2">
+      <w:start w:val="1"/>
+      <w:numFmt w:val="decimal"/>
+      <w:lvlText w:val="%3."/>
+      <w:lvlJc w:val="left"/>
+      <w:pPr>
+        <w:ind w:left="2160" w:hanging="360"/>
+      </w:pPr>
+    </w:lvl>
+    <w:lvl w:ilvl="3">
+      <w:start w:val="1"/>
+      <w:numFmt w:val="decimal"/>
+      <w:lvlText w:val="%4."/>
+      <w:lvlJc w:val="left"/>
+      <w:pPr>
+        <w:ind w:left="2880" w:hanging="360"/>
+      </w:pPr>
+    </w:lvl>
+    <w:lvl w:ilvl="4">
+      <w:start w:val="1"/>
+      <w:numFmt w:val="decimal"/>
+      <w:lvlText w:val="%5."/>
+      <w:lvlJc w:val="left"/>
+      <w:pPr>
+        <w:ind w:left="3600" w:hanging="360"/>
+      </w:pPr>
+    </w:lvl>
+    <w:lvl w:ilvl="5">
+      <w:start w:val="1"/>
+      <w:numFmt w:val="decimal"/>
+      <w:lvlText w:val="%6."/>
+      <w:lvlJc w:val="left"/>
+      <w:pPr>
+        <w:ind w:left="4320" w:hanging="360"/>
+      </w:pPr>
+    </w:lvl>
+    <w:lvl w:ilvl="6">
+      <w:start w:val="1"/>
+      <w:numFmt w:val="decimal"/>
+      <w:lvlText w:val="%7."/>
+      <w:lvlJc w:val="left"/>
+      <w:pPr>
+        <w:ind w:left="5040" w:hanging="360"/>
+      </w:pPr>
+    </w:lvl>
+    <w:lvl w:ilvl="7">
+      <w:start w:val="1"/>
+      <w:numFmt w:val="decimal"/>
+      <w:lvlText w:val="%8."/>
+      <w:lvlJc w:val="left"/>
+      <w:pPr>
+        <w:ind w:left="5760" w:hanging="360"/>
+      </w:pPr>
+    </w:lvl>
+    <w:lvl w:ilvl="8">
+      <w:start w:val="1"/>
+      <w:numFmt w:val="decimal"/>
+      <w:lvlText w:val="%9."/>
+      <w:lvlJc w:val="left"/>
+      <w:pPr>
+        <w:ind w:left="6480" w:hanging="360"/>
+      </w:pPr>
+    </w:lvl>
+  </w:abstractNum>
   <w:num w16cid:durableId="1839423215" w:numId="1">
     <w:abstractNumId w:val="0"/>
   </w:num>
@@ -5335,9 +5977,51 @@
     <w:abstractNumId w:val="991"/>
   </w:num>
   <w:num w:numId="1043">
+    <w:abstractNumId w:val="99411"/>
+    <w:lvlOverride w:ilvl="0">
+      <w:startOverride w:val="1"/>
+    </w:lvlOverride>
+    <w:lvlOverride w:ilvl="1">
+      <w:startOverride w:val="1"/>
+    </w:lvlOverride>
+    <w:lvlOverride w:ilvl="2">
+      <w:startOverride w:val="1"/>
+    </w:lvlOverride>
+    <w:lvlOverride w:ilvl="3">
+      <w:startOverride w:val="1"/>
+    </w:lvlOverride>
+    <w:lvlOverride w:ilvl="4">
+      <w:startOverride w:val="1"/>
+    </w:lvlOverride>
+    <w:lvlOverride w:ilvl="5">
+      <w:startOverride w:val="1"/>
+    </w:lvlOverride>
+    <w:lvlOverride w:ilvl="6">
+      <w:startOverride w:val="1"/>
+    </w:lvlOverride>
+    <w:lvlOverride w:ilvl="7">
+      <w:startOverride w:val="1"/>
+    </w:lvlOverride>
+    <w:lvlOverride w:ilvl="8">
+      <w:startOverride w:val="1"/>
+    </w:lvlOverride>
+  </w:num>
+  <w:num w:numId="1044">
     <w:abstractNumId w:val="991"/>
   </w:num>
-  <w:num w:numId="1044">
+  <w:num w:numId="1045">
+    <w:abstractNumId w:val="991"/>
+  </w:num>
+  <w:num w:numId="1046">
+    <w:abstractNumId w:val="991"/>
+  </w:num>
+  <w:num w:numId="1047">
+    <w:abstractNumId w:val="991"/>
+  </w:num>
+  <w:num w:numId="1048">
+    <w:abstractNumId w:val="991"/>
+  </w:num>
+  <w:num w:numId="1049">
     <w:abstractNumId w:val="991"/>
   </w:num>
 </w:numbering>

</xml_diff>